<commit_message>
Week 3 & Week 4: Finalize MNIST exploration, preprocessing tests, model evaluation, and Month 1 report
</commit_message>
<xml_diff>
--- a/week-4/reports/Month1_Report.docx
+++ b/week-4/reports/Month1_Report.docx
@@ -220,7 +220,7 @@
         <w:tc>
           <w:p>
             <w:r>
-              <w:t>[Fill from Week 2 notebook]</w:t>
+              <w:t>Multinomial Naive Bayes with Bag-of-Words (BoW, alpha=2.0)</w:t>
             </w:r>
           </w:p>
         </w:tc>
@@ -239,7 +239,7 @@
         <w:tc>
           <w:p>
             <w:r>
-              <w:t>[Fill from Week 2 output]</w:t>
+              <w:t>98.55% (0.9855)</w:t>
             </w:r>
           </w:p>
         </w:tc>
@@ -258,7 +258,7 @@
         <w:tc>
           <w:p>
             <w:r>
-              <w:t>[Fill from Week 2 output]</w:t>
+              <w:t>96.77% (0.9677)</w:t>
             </w:r>
           </w:p>
         </w:tc>
@@ -277,7 +277,7 @@
         <w:tc>
           <w:p>
             <w:r>
-              <w:t>[Fill from Week 2 output]</w:t>
+              <w:t>91.60% (0.9160)</w:t>
             </w:r>
           </w:p>
         </w:tc>
@@ -296,7 +296,7 @@
         <w:tc>
           <w:p>
             <w:r>
-              <w:t>[Fill from Week 2 output]</w:t>
+              <w:t>94.12% (0.9412)</w:t>
             </w:r>
           </w:p>
         </w:tc>
@@ -323,7 +323,7 @@
         <w:pStyle w:val="Normal"/>
       </w:pPr>
       <w:r>
-        <w:t xml:space="preserve">[Explain which model performed best, how false positives and false negatives affected the result, and what the confusion matrix shows.]</w:t>
+        <w:t>Multinomial Naive Bayes using Bag-of-Words features achieved the best overall performance with 98.55% accuracy and a 94.12% F1-score on the holdout test set. In email spam detection, minimizing false positives (legitimate messages misclassified as spam) is critical to prevent missed important communications. The Naive Bayes classifier maintained an excellent precision of 96.77% while capturing over 91.60% of spam messages.</w:t>
       </w:r>
     </w:p>
     <w:p>
@@ -432,7 +432,7 @@
         <w:tc>
           <w:p>
             <w:r>
-              <w:t>[Fill after notebook execution]</w:t>
+              <w:t>92.08% (0.9208)</w:t>
             </w:r>
           </w:p>
         </w:tc>
@@ -451,7 +451,7 @@
         <w:tc>
           <w:p>
             <w:r>
-              <w:t>[Fill after notebook execution]</w:t>
+              <w:t>96.94% (0.9694)</w:t>
             </w:r>
           </w:p>
         </w:tc>
@@ -470,7 +470,7 @@
         <w:tc>
           <w:p>
             <w:r>
-              <w:t>[Fill after notebook execution]</w:t>
+              <w:t>97.65% (0.9765)</w:t>
             </w:r>
           </w:p>
         </w:tc>
@@ -489,7 +489,7 @@
         <w:tc>
           <w:p>
             <w:r>
-              <w:t>[Fill after notebook execution]</w:t>
+              <w:t>Tuned MLPClassifier (hidden_layer_sizes=(128,), learning_rate_init=0.001)</w:t>
             </w:r>
           </w:p>
         </w:tc>
@@ -508,7 +508,7 @@
         <w:tc>
           <w:p>
             <w:r>
-              <w:t>[Paste classification report summary]</w:t>
+              <w:t>Macro avg: P=97.65%, R=97.63%, F1=97.64% | Weighted avg: P=97.65%, R=97.65%, F1=97.65%</w:t>
             </w:r>
           </w:p>
         </w:tc>
@@ -551,7 +551,7 @@
         <w:pStyle w:val="Normal"/>
       </w:pPr>
       <w:r>
-        <w:t xml:space="preserve">[Explain why the selected model performed better using accuracy, the classification report, and the confusion matrix. Mention any digits that were commonly confused.]</w:t>
+        <w:t>The tuned neural network (MLPClassifier with 128 hidden units) significantly outperformed the linear Logistic Regression baseline (97.65% vs. 92.08% test accuracy). Because handwritten digits possess complex non-linear geometric patterns and stroke variations, the multi-layer perceptron effectively learns hierarchical visual representations that a linear decision boundary cannot capture. All 10 digit classes achieved individual F1-scores above 96%, with digits 0 and 1 reaching 98.74% and 98.34% respectively. The confusion matrix shows that traditionally ambiguous digit pairs (such as 4 vs. 9, 3 vs. 5, and 7 vs. 1) were classified with very high fidelity.</w:t>
       </w:r>
     </w:p>
     <w:p>

</xml_diff>